<commit_message>
Completa la Fase 3 e integra las cuatro hipótesis
</commit_message>
<xml_diff>
--- a/docs/fase3/Informe_Fase3.docx
+++ b/docs/fase3/Informe_Fase3.docx
@@ -61,7 +61,7 @@
     </w:p>
     <w:p>
       <w:r>
-        <w:t>Resultados reproducidos. Interpretación acotada validada por el grupo.</w:t>
+        <w:t>Resultados reproducidos. Integración de hipótesis para revisión final del grupo.</w:t>
       </w:r>
     </w:p>
     <w:p>
@@ -119,12 +119,27 @@
     </w:p>
     <w:p>
       <w:r>
-        <w:t>9. Discusión y conclusiones académicas  ................................................................  11</w:t>
+        <w:t>9. H1: gravedad registrada por zona  ................................................................  11</w:t>
       </w:r>
     </w:p>
     <w:p>
       <w:r>
-        <w:t>10. Reproducibilidad, referencias y uso de IA  ................................................................  12</w:t>
+        <w:t>10. H3: siniestros con motociclistas  ................................................................  12</w:t>
+      </w:r>
+    </w:p>
+    <w:p>
+      <w:r>
+        <w:t>11. Integración de las cuatro hipótesis y edad desconocida  ................................................................  13</w:t>
+      </w:r>
+    </w:p>
+    <w:p>
+      <w:r>
+        <w:t>12. Discusión y conclusiones académicas  ................................................................  14</w:t>
+      </w:r>
+    </w:p>
+    <w:p>
+      <w:r>
+        <w:t>13. Reproducibilidad, referencias y uso de IA  ................................................................  15</w:t>
       </w:r>
     </w:p>
     <w:p>
@@ -165,12 +180,12 @@
     </w:p>
     <w:p>
       <w:r>
-        <w:t>No hubo devolución docente de Fase 2, confirmado por el grupo. Se corrigieron en Fase 3 la descripción de familias, la denominación de test independiente y los faltantes de inferencia, evaluación y documentación. Los notebooks históricos se preservaron.</w:t>
+        <w:t>No hubo devolución docente de Fase 2, confirmado por el grupo. Aclaraciones propias de esta revisión: H1 conserva el contraste Interior/Metropolitana y explicita su cobertura y efecto pequeño; H3 audita las fuentes sin acreditar categorías individuales por vehículo; H4 separa 353 edades ignoradas y advierte que el contraste ordinal anterior conservó -1. Se mantiene la reserva históricamente inspeccionada y el alcance retrospectivo del modelo. Los notebooks de Fases 1 y 2 se preservan.</w:t>
       </w:r>
     </w:p>
     <w:p>
       <w:r>
-        <w:t>La tabla 12.2.1 procede de la Policía Nacional; las tablas territoriales y de siniestros con motociclistas, de la Patrulla Caminera. Comparten año, pero no necesariamente universo o unidad de registro.</w:t>
+        <w:t>La tabla 12.2.1 procede de la Policía Nacional; 12.2.5 y 12.2.10 citan a Patrulla Caminera; 12.2.6 también cita a Policía Nacional. Comparten año, pero no necesariamente universo o unidad de registro.</w:t>
       </w:r>
     </w:p>
     <w:p>
@@ -188,7 +203,7 @@
     </w:p>
     <w:p>
       <w:r>
-        <w:t>Se utilizan únicamente sexo y grupo_edad. Se excluyen id_victima y gravedad por ser identificador y objetivo directo; es_hombre, es_adulto_mayor y edad_orden duplican las variables disponibles. Ignorado se conserva como edad no informada. OneHotEncoder(drop=first, handle_unknown=ignore) se ajusta dentro de los pipelines de los tres modelos originales. No se requiere escalado de indicadores binarios o árboles. No se silencian advertencias globalmente.</w:t>
+        <w:t>Se utilizan únicamente sexo y grupo_edad. Se excluyen id_victima y gravedad por ser identificador y objetivo directo; es_hombre, es_adulto_mayor y edad_orden duplican las variables disponibles. Las 353 víctimas de edad ignorada permanecen separadas; -1 significa desconocido y el indicador de adulto mayor en 0 no acredita edad menor de 60. OneHotEncoder(drop=first, handle_unknown=ignore) se ajusta dentro de los pipelines de los tres modelos originales. No se requiere escalado de indicadores binarios o árboles. No se silencian advertencias globalmente.</w:t>
       </w:r>
     </w:p>
     <w:p>
@@ -2212,7 +2227,1051 @@
         <w:pStyle w:val="Heading1"/>
       </w:pPr>
       <w:r>
-        <w:t>9. Discusión y conclusiones académicas</w:t>
+        <w:t>9. H1: gravedad registrada por zona</w:t>
+      </w:r>
+    </w:p>
+    <w:p>
+      <w:pPr>
+        <w:pStyle w:val="Caption"/>
+      </w:pPr>
+      <w:r>
+        <w:t>Tabla H1. Frecuencias territoriales cotejadas con 12.2.6.</w:t>
+      </w:r>
+    </w:p>
+    <w:tbl>
+      <w:tblPr>
+        <w:tblStyle w:val="TableGrid"/>
+        <w:tblW w:type="dxa" w:w="9360"/>
+        <w:tblLayout w:type="fixed"/>
+        <w:tblLook w:firstColumn="1" w:firstRow="1" w:lastColumn="0" w:lastRow="0" w:noHBand="0" w:noVBand="1" w:val="04A0"/>
+        <w:tblInd w:w="120" w:type="dxa"/>
+        <w:tblCellMar>
+          <w:top w:w="80" w:type="dxa"/>
+          <w:bottom w:w="80" w:type="dxa"/>
+          <w:start w:w="120" w:type="dxa"/>
+          <w:end w:w="120" w:type="dxa"/>
+        </w:tblCellMar>
+      </w:tblPr>
+      <w:tblGrid>
+        <w:gridCol w:w="2600"/>
+        <w:gridCol w:w="1690"/>
+        <w:gridCol w:w="1690"/>
+        <w:gridCol w:w="1690"/>
+        <w:gridCol w:w="1690"/>
+      </w:tblGrid>
+      <w:tr>
+        <w:trPr>
+          <w:cantSplit/>
+          <w:tblHeader/>
+        </w:trPr>
+        <w:tc>
+          <w:tcPr>
+            <w:tcW w:type="dxa" w:w="2600"/>
+            <w:shd w:fill="F2F4F7"/>
+          </w:tcPr>
+          <w:p>
+            <w:pPr>
+              <w:pStyle w:val="CompactTable"/>
+            </w:pPr>
+            <w:r>
+              <w:t>Zona</w:t>
+            </w:r>
+          </w:p>
+        </w:tc>
+        <w:tc>
+          <w:tcPr>
+            <w:tcW w:type="dxa" w:w="1690"/>
+            <w:shd w:fill="F2F4F7"/>
+          </w:tcPr>
+          <w:p>
+            <w:pPr>
+              <w:pStyle w:val="CompactTable"/>
+            </w:pPr>
+            <w:r>
+              <w:t>Heridos</w:t>
+            </w:r>
+          </w:p>
+        </w:tc>
+        <w:tc>
+          <w:tcPr>
+            <w:tcW w:type="dxa" w:w="1690"/>
+            <w:shd w:fill="F2F4F7"/>
+          </w:tcPr>
+          <w:p>
+            <w:pPr>
+              <w:pStyle w:val="CompactTable"/>
+            </w:pPr>
+            <w:r>
+              <w:t>Fallecidos</w:t>
+            </w:r>
+          </w:p>
+        </w:tc>
+        <w:tc>
+          <w:tcPr>
+            <w:tcW w:type="dxa" w:w="1690"/>
+            <w:shd w:fill="F2F4F7"/>
+          </w:tcPr>
+          <w:p>
+            <w:pPr>
+              <w:pStyle w:val="CompactTable"/>
+            </w:pPr>
+            <w:r>
+              <w:t>Víctimas</w:t>
+            </w:r>
+          </w:p>
+        </w:tc>
+        <w:tc>
+          <w:tcPr>
+            <w:tcW w:type="dxa" w:w="1690"/>
+            <w:shd w:fill="F2F4F7"/>
+          </w:tcPr>
+          <w:p>
+            <w:pPr>
+              <w:pStyle w:val="CompactTable"/>
+            </w:pPr>
+            <w:r>
+              <w:t>Fallecidos (%)</w:t>
+            </w:r>
+          </w:p>
+        </w:tc>
+      </w:tr>
+      <w:tr>
+        <w:trPr>
+          <w:cantSplit/>
+        </w:trPr>
+        <w:tc>
+          <w:tcPr>
+            <w:tcW w:type="dxa" w:w="2600"/>
+          </w:tcPr>
+          <w:p>
+            <w:pPr>
+              <w:pStyle w:val="CompactTable"/>
+            </w:pPr>
+            <w:r>
+              <w:t>Asunción</w:t>
+            </w:r>
+          </w:p>
+        </w:tc>
+        <w:tc>
+          <w:tcPr>
+            <w:tcW w:type="dxa" w:w="1690"/>
+          </w:tcPr>
+          <w:p>
+            <w:pPr>
+              <w:pStyle w:val="CompactTable"/>
+            </w:pPr>
+            <w:r>
+              <w:t>141</w:t>
+            </w:r>
+          </w:p>
+        </w:tc>
+        <w:tc>
+          <w:tcPr>
+            <w:tcW w:type="dxa" w:w="1690"/>
+          </w:tcPr>
+          <w:p>
+            <w:pPr>
+              <w:pStyle w:val="CompactTable"/>
+            </w:pPr>
+            <w:r>
+              <w:t>26</w:t>
+            </w:r>
+          </w:p>
+        </w:tc>
+        <w:tc>
+          <w:tcPr>
+            <w:tcW w:type="dxa" w:w="1690"/>
+          </w:tcPr>
+          <w:p>
+            <w:pPr>
+              <w:pStyle w:val="CompactTable"/>
+            </w:pPr>
+            <w:r>
+              <w:t>167</w:t>
+            </w:r>
+          </w:p>
+        </w:tc>
+        <w:tc>
+          <w:tcPr>
+            <w:tcW w:type="dxa" w:w="1690"/>
+          </w:tcPr>
+          <w:p>
+            <w:pPr>
+              <w:pStyle w:val="CompactTable"/>
+            </w:pPr>
+            <w:r>
+              <w:t>15.5689</w:t>
+            </w:r>
+          </w:p>
+        </w:tc>
+      </w:tr>
+      <w:tr>
+        <w:trPr>
+          <w:cantSplit/>
+        </w:trPr>
+        <w:tc>
+          <w:tcPr>
+            <w:tcW w:type="dxa" w:w="2600"/>
+          </w:tcPr>
+          <w:p>
+            <w:pPr>
+              <w:pStyle w:val="CompactTable"/>
+            </w:pPr>
+            <w:r>
+              <w:t>Central</w:t>
+            </w:r>
+          </w:p>
+        </w:tc>
+        <w:tc>
+          <w:tcPr>
+            <w:tcW w:type="dxa" w:w="1690"/>
+          </w:tcPr>
+          <w:p>
+            <w:pPr>
+              <w:pStyle w:val="CompactTable"/>
+            </w:pPr>
+            <w:r>
+              <w:t>394</w:t>
+            </w:r>
+          </w:p>
+        </w:tc>
+        <w:tc>
+          <w:tcPr>
+            <w:tcW w:type="dxa" w:w="1690"/>
+          </w:tcPr>
+          <w:p>
+            <w:pPr>
+              <w:pStyle w:val="CompactTable"/>
+            </w:pPr>
+            <w:r>
+              <w:t>82</w:t>
+            </w:r>
+          </w:p>
+        </w:tc>
+        <w:tc>
+          <w:tcPr>
+            <w:tcW w:type="dxa" w:w="1690"/>
+          </w:tcPr>
+          <w:p>
+            <w:pPr>
+              <w:pStyle w:val="CompactTable"/>
+            </w:pPr>
+            <w:r>
+              <w:t>476</w:t>
+            </w:r>
+          </w:p>
+        </w:tc>
+        <w:tc>
+          <w:tcPr>
+            <w:tcW w:type="dxa" w:w="1690"/>
+          </w:tcPr>
+          <w:p>
+            <w:pPr>
+              <w:pStyle w:val="CompactTable"/>
+            </w:pPr>
+            <w:r>
+              <w:t>17.2269</w:t>
+            </w:r>
+          </w:p>
+        </w:tc>
+      </w:tr>
+      <w:tr>
+        <w:trPr>
+          <w:cantSplit/>
+        </w:trPr>
+        <w:tc>
+          <w:tcPr>
+            <w:tcW w:type="dxa" w:w="2600"/>
+          </w:tcPr>
+          <w:p>
+            <w:pPr>
+              <w:pStyle w:val="CompactTable"/>
+            </w:pPr>
+            <w:r>
+              <w:t>Interior</w:t>
+            </w:r>
+          </w:p>
+        </w:tc>
+        <w:tc>
+          <w:tcPr>
+            <w:tcW w:type="dxa" w:w="1690"/>
+          </w:tcPr>
+          <w:p>
+            <w:pPr>
+              <w:pStyle w:val="CompactTable"/>
+            </w:pPr>
+            <w:r>
+              <w:t>661</w:t>
+            </w:r>
+          </w:p>
+        </w:tc>
+        <w:tc>
+          <w:tcPr>
+            <w:tcW w:type="dxa" w:w="1690"/>
+          </w:tcPr>
+          <w:p>
+            <w:pPr>
+              <w:pStyle w:val="CompactTable"/>
+            </w:pPr>
+            <w:r>
+              <w:t>187</w:t>
+            </w:r>
+          </w:p>
+        </w:tc>
+        <w:tc>
+          <w:tcPr>
+            <w:tcW w:type="dxa" w:w="1690"/>
+          </w:tcPr>
+          <w:p>
+            <w:pPr>
+              <w:pStyle w:val="CompactTable"/>
+            </w:pPr>
+            <w:r>
+              <w:t>848</w:t>
+            </w:r>
+          </w:p>
+        </w:tc>
+        <w:tc>
+          <w:tcPr>
+            <w:tcW w:type="dxa" w:w="1690"/>
+          </w:tcPr>
+          <w:p>
+            <w:pPr>
+              <w:pStyle w:val="CompactTable"/>
+            </w:pPr>
+            <w:r>
+              <w:t>22.0519</w:t>
+            </w:r>
+          </w:p>
+        </w:tc>
+      </w:tr>
+    </w:tbl>
+    <w:p>
+      <w:r>
+        <w:drawing>
+          <wp:inline xmlns:a="http://schemas.openxmlformats.org/drawingml/2006/main" xmlns:pic="http://schemas.openxmlformats.org/drawingml/2006/picture">
+            <wp:extent cx="5943600" cy="2748383"/>
+            <wp:docPr id="6" name="Picture 6"/>
+            <wp:cNvGraphicFramePr>
+              <a:graphicFrameLocks noChangeAspect="1"/>
+            </wp:cNvGraphicFramePr>
+            <a:graphic>
+              <a:graphicData uri="http://schemas.openxmlformats.org/drawingml/2006/picture">
+                <pic:pic>
+                  <pic:nvPicPr>
+                    <pic:cNvPr id="0" name="image.png"/>
+                    <pic:cNvPicPr/>
+                  </pic:nvPicPr>
+                  <pic:blipFill>
+                    <a:blip r:embed="rId16"/>
+                    <a:stretch>
+                      <a:fillRect/>
+                    </a:stretch>
+                  </pic:blipFill>
+                  <pic:spPr>
+                    <a:xfrm>
+                      <a:off x="0" y="0"/>
+                      <a:ext cx="5943600" cy="2748383"/>
+                    </a:xfrm>
+                    <a:prstGeom prst="rect"/>
+                  </pic:spPr>
+                </pic:pic>
+              </a:graphicData>
+            </a:graphic>
+          </wp:inline>
+        </w:drawing>
+      </w:r>
+    </w:p>
+    <w:p>
+      <w:pPr>
+        <w:pStyle w:val="Caption"/>
+      </w:pPr>
+      <w:r>
+        <w:t>Figura F3-10. Fracción de fallecidos por zona; cada barra indica fallecidos/total de víctimas.</w:t>
+      </w:r>
+    </w:p>
+    <w:p>
+      <w:r>
+        <w:t>Las fracciones de fallecidos entre víctimas registradas son Asunción 15.57 %, Central 17.23 % e Interior 22.05 %. Metropolitana agrupa Asunción y Central: 108/643 = 16.80 %; Interior la supera en 5.26 puntos porcentuales. H1 de Fase 2 informó χ² = 6.3647 (gl = 1), p crudo 0.011641 y p Bonferroni 0.046565; OR = 1.4014; V de Cramér = 0.0653. El efecto es pequeño y el p ajustado queda cerca de 0,05. La decisión corresponde a esa agrupación y familia de cuatro contrastes, no a todas las comparaciones entre zonas. Mostrar tres tasas revela la heterogeneidad que la dicotomía oculta; no se buscan nuevos p-valores. La cobertura institucional, el registro, la exposición y la atención pueden influir. Son proporciones entre víctimas, no riesgo poblacional de accidente ni un efecto causal de residir en una zona. Tres agregados no justifican un predictor individual generalizable; no se expanden ni se enlazan con los perfiles demográficos.</w:t>
+      </w:r>
+    </w:p>
+    <w:p>
+      <w:r>
+        <w:br w:type="page"/>
+      </w:r>
+    </w:p>
+    <w:p>
+      <w:pPr>
+        <w:pStyle w:val="Heading1"/>
+      </w:pPr>
+      <w:r>
+        <w:t>10. H3: siniestros con motociclistas</w:t>
+      </w:r>
+    </w:p>
+    <w:p>
+      <w:pPr>
+        <w:pStyle w:val="Caption"/>
+      </w:pPr>
+      <w:r>
+        <w:t>Tabla H3. Dos fuentes y una resta histórica: las filas no son categorías oficiales excluyentes.</w:t>
+      </w:r>
+    </w:p>
+    <w:tbl>
+      <w:tblPr>
+        <w:tblStyle w:val="TableGrid"/>
+        <w:tblW w:type="dxa" w:w="9360"/>
+        <w:tblLayout w:type="fixed"/>
+        <w:tblLook w:firstColumn="1" w:firstRow="1" w:lastColumn="0" w:lastRow="0" w:noHBand="0" w:noVBand="1" w:val="04A0"/>
+        <w:tblInd w:w="120" w:type="dxa"/>
+        <w:tblCellMar>
+          <w:top w:w="80" w:type="dxa"/>
+          <w:bottom w:w="80" w:type="dxa"/>
+          <w:start w:w="120" w:type="dxa"/>
+          <w:end w:w="120" w:type="dxa"/>
+        </w:tblCellMar>
+      </w:tblPr>
+      <w:tblGrid>
+        <w:gridCol w:w="2600"/>
+        <w:gridCol w:w="2253"/>
+        <w:gridCol w:w="2253"/>
+        <w:gridCol w:w="2254"/>
+      </w:tblGrid>
+      <w:tr>
+        <w:trPr>
+          <w:cantSplit/>
+          <w:tblHeader/>
+        </w:trPr>
+        <w:tc>
+          <w:tcPr>
+            <w:tcW w:type="dxa" w:w="2600"/>
+            <w:shd w:fill="F2F4F7"/>
+          </w:tcPr>
+          <w:p>
+            <w:pPr>
+              <w:pStyle w:val="CompactTable"/>
+            </w:pPr>
+            <w:r>
+              <w:t>Fuente / operación</w:t>
+            </w:r>
+          </w:p>
+        </w:tc>
+        <w:tc>
+          <w:tcPr>
+            <w:tcW w:type="dxa" w:w="2253"/>
+            <w:shd w:fill="F2F4F7"/>
+          </w:tcPr>
+          <w:p>
+            <w:pPr>
+              <w:pStyle w:val="CompactTable"/>
+            </w:pPr>
+            <w:r>
+              <w:t>Heridos</w:t>
+            </w:r>
+          </w:p>
+        </w:tc>
+        <w:tc>
+          <w:tcPr>
+            <w:tcW w:type="dxa" w:w="2253"/>
+            <w:shd w:fill="F2F4F7"/>
+          </w:tcPr>
+          <w:p>
+            <w:pPr>
+              <w:pStyle w:val="CompactTable"/>
+            </w:pPr>
+            <w:r>
+              <w:t>Fallecidos</w:t>
+            </w:r>
+          </w:p>
+        </w:tc>
+        <w:tc>
+          <w:tcPr>
+            <w:tcW w:type="dxa" w:w="2254"/>
+            <w:shd w:fill="F2F4F7"/>
+          </w:tcPr>
+          <w:p>
+            <w:pPr>
+              <w:pStyle w:val="CompactTable"/>
+            </w:pPr>
+            <w:r>
+              <w:t>Fallecidos (%)</w:t>
+            </w:r>
+          </w:p>
+        </w:tc>
+      </w:tr>
+      <w:tr>
+        <w:trPr>
+          <w:cantSplit/>
+        </w:trPr>
+        <w:tc>
+          <w:tcPr>
+            <w:tcW w:type="dxa" w:w="2600"/>
+          </w:tcPr>
+          <w:p>
+            <w:pPr>
+              <w:pStyle w:val="CompactTable"/>
+            </w:pPr>
+            <w:r>
+              <w:t>12.2.10: siniestros con motociclistas</w:t>
+            </w:r>
+          </w:p>
+        </w:tc>
+        <w:tc>
+          <w:tcPr>
+            <w:tcW w:type="dxa" w:w="2253"/>
+          </w:tcPr>
+          <w:p>
+            <w:pPr>
+              <w:pStyle w:val="CompactTable"/>
+            </w:pPr>
+            <w:r>
+              <w:t>384</w:t>
+            </w:r>
+          </w:p>
+        </w:tc>
+        <w:tc>
+          <w:tcPr>
+            <w:tcW w:type="dxa" w:w="2253"/>
+          </w:tcPr>
+          <w:p>
+            <w:pPr>
+              <w:pStyle w:val="CompactTable"/>
+            </w:pPr>
+            <w:r>
+              <w:t>155</w:t>
+            </w:r>
+          </w:p>
+        </w:tc>
+        <w:tc>
+          <w:tcPr>
+            <w:tcW w:type="dxa" w:w="2254"/>
+          </w:tcPr>
+          <w:p>
+            <w:pPr>
+              <w:pStyle w:val="CompactTable"/>
+            </w:pPr>
+            <w:r>
+              <w:t>28.7570</w:t>
+            </w:r>
+          </w:p>
+        </w:tc>
+      </w:tr>
+      <w:tr>
+        <w:trPr>
+          <w:cantSplit/>
+        </w:trPr>
+        <w:tc>
+          <w:tcPr>
+            <w:tcW w:type="dxa" w:w="2600"/>
+          </w:tcPr>
+          <w:p>
+            <w:pPr>
+              <w:pStyle w:val="CompactTable"/>
+            </w:pPr>
+            <w:r>
+              <w:t>12.2.5: cobertura total</w:t>
+            </w:r>
+          </w:p>
+        </w:tc>
+        <w:tc>
+          <w:tcPr>
+            <w:tcW w:type="dxa" w:w="2253"/>
+          </w:tcPr>
+          <w:p>
+            <w:pPr>
+              <w:pStyle w:val="CompactTable"/>
+            </w:pPr>
+            <w:r>
+              <w:t>1055</w:t>
+            </w:r>
+          </w:p>
+        </w:tc>
+        <w:tc>
+          <w:tcPr>
+            <w:tcW w:type="dxa" w:w="2253"/>
+          </w:tcPr>
+          <w:p>
+            <w:pPr>
+              <w:pStyle w:val="CompactTable"/>
+            </w:pPr>
+            <w:r>
+              <w:t>269</w:t>
+            </w:r>
+          </w:p>
+        </w:tc>
+        <w:tc>
+          <w:tcPr>
+            <w:tcW w:type="dxa" w:w="2254"/>
+          </w:tcPr>
+          <w:p>
+            <w:pPr>
+              <w:pStyle w:val="CompactTable"/>
+            </w:pPr>
+            <w:r>
+              <w:t>20.3172</w:t>
+            </w:r>
+          </w:p>
+        </w:tc>
+      </w:tr>
+      <w:tr>
+        <w:trPr>
+          <w:cantSplit/>
+        </w:trPr>
+        <w:tc>
+          <w:tcPr>
+            <w:tcW w:type="dxa" w:w="2600"/>
+          </w:tcPr>
+          <w:p>
+            <w:pPr>
+              <w:pStyle w:val="CompactTable"/>
+            </w:pPr>
+            <w:r>
+              <w:t>Resta condicionada</w:t>
+            </w:r>
+          </w:p>
+        </w:tc>
+        <w:tc>
+          <w:tcPr>
+            <w:tcW w:type="dxa" w:w="2253"/>
+          </w:tcPr>
+          <w:p>
+            <w:pPr>
+              <w:pStyle w:val="CompactTable"/>
+            </w:pPr>
+            <w:r>
+              <w:t>671</w:t>
+            </w:r>
+          </w:p>
+        </w:tc>
+        <w:tc>
+          <w:tcPr>
+            <w:tcW w:type="dxa" w:w="2253"/>
+          </w:tcPr>
+          <w:p>
+            <w:pPr>
+              <w:pStyle w:val="CompactTable"/>
+            </w:pPr>
+            <w:r>
+              <w:t>114</w:t>
+            </w:r>
+          </w:p>
+        </w:tc>
+        <w:tc>
+          <w:tcPr>
+            <w:tcW w:type="dxa" w:w="2254"/>
+          </w:tcPr>
+          <w:p>
+            <w:pPr>
+              <w:pStyle w:val="CompactTable"/>
+            </w:pPr>
+            <w:r>
+              <w:t>14.5223</w:t>
+            </w:r>
+          </w:p>
+        </w:tc>
+      </w:tr>
+    </w:tbl>
+    <w:p>
+      <w:r>
+        <w:drawing>
+          <wp:inline xmlns:a="http://schemas.openxmlformats.org/drawingml/2006/main" xmlns:pic="http://schemas.openxmlformats.org/drawingml/2006/picture">
+            <wp:extent cx="5943600" cy="2157833"/>
+            <wp:docPr id="7" name="Picture 7"/>
+            <wp:cNvGraphicFramePr>
+              <a:graphicFrameLocks noChangeAspect="1"/>
+            </wp:cNvGraphicFramePr>
+            <a:graphic>
+              <a:graphicData uri="http://schemas.openxmlformats.org/drawingml/2006/picture">
+                <pic:pic>
+                  <pic:nvPicPr>
+                    <pic:cNvPr id="0" name="image.png"/>
+                    <pic:cNvPicPr/>
+                  </pic:nvPicPr>
+                  <pic:blipFill>
+                    <a:blip r:embed="rId17"/>
+                    <a:stretch>
+                      <a:fillRect/>
+                    </a:stretch>
+                  </pic:blipFill>
+                  <pic:spPr>
+                    <a:xfrm>
+                      <a:off x="0" y="0"/>
+                      <a:ext cx="5943600" cy="2157833"/>
+                    </a:xfrm>
+                    <a:prstGeom prst="rect"/>
+                  </pic:spPr>
+                </pic:pic>
+              </a:graphicData>
+            </a:graphic>
+          </wp:inline>
+        </w:drawing>
+      </w:r>
+    </w:p>
+    <w:p>
+      <w:pPr>
+        <w:pStyle w:val="Caption"/>
+      </w:pPr>
+      <w:r>
+        <w:t>Figura F3-11. Conteos documentados y fracción mensual de fallecidos en 12.2.10; las fuentes no deben sumarse.</w:t>
+      </w:r>
+    </w:p>
+    <w:p>
+      <w:r>
+        <w:t>12.2.10 documenta 539 víctimas de siniestros protagonizados por motociclistas: 384 heridos y 155 fallecidos (28.76 %). 12.2.5 registra 1324 víctimas: 1055 heridos y 269 fallecidos (20.32 %) en Central e Interior. Se selecciona 2021 en ambas y se verifican los doce meses. La resta histórica da 671 heridos y 114 fallecidos; es la procedencia numérica del CSV vehicular, no una validación de sus etiquetas. Aunque ambos cuadros citan a Patrulla Caminera y las restas mensuales son no negativas, no se acredita que cada víctima viajara en moto ni que sean subconjuntos de cobertura idéntica. Las barras representan fuentes posiblemente superpuestas y no deben sumarse. La serie mensual describe esa cobertura, sin demostrar estacionalidad ni causas. H3 histórico informó RR = 1.9802; OR = 2.3758 y p Bonferroni 5.085e-10; se conserva como contraste condicionado. Ni RR, OR ni significación acreditan mayor riesgo individual de motociclistas si las categorías no están validadas. No se entrena un segundo predictor ni se unen estas filas expandidas con la base demográfica.</w:t>
+      </w:r>
+    </w:p>
+    <w:p>
+      <w:r>
+        <w:br w:type="page"/>
+      </w:r>
+    </w:p>
+    <w:p>
+      <w:pPr>
+        <w:pStyle w:val="Heading1"/>
+      </w:pPr>
+      <w:r>
+        <w:t>11. Integración de las cuatro hipótesis y edad desconocida</w:t>
+      </w:r>
+    </w:p>
+    <w:p>
+      <w:pPr>
+        <w:pStyle w:val="Caption"/>
+      </w:pPr>
+      <w:r>
+        <w:t>Tabla H1-H4. Relación entre antecedentes, predictor y límites de las fuentes.</w:t>
+      </w:r>
+    </w:p>
+    <w:tbl>
+      <w:tblPr>
+        <w:tblStyle w:val="TableGrid"/>
+        <w:tblW w:type="dxa" w:w="9360"/>
+        <w:tblLayout w:type="fixed"/>
+        <w:tblLook w:firstColumn="1" w:firstRow="1" w:lastColumn="0" w:lastRow="0" w:noHBand="0" w:noVBand="1" w:val="04A0"/>
+        <w:tblInd w:w="120" w:type="dxa"/>
+        <w:tblCellMar>
+          <w:top w:w="80" w:type="dxa"/>
+          <w:bottom w:w="80" w:type="dxa"/>
+          <w:start w:w="120" w:type="dxa"/>
+          <w:end w:w="120" w:type="dxa"/>
+        </w:tblCellMar>
+      </w:tblPr>
+      <w:tblGrid>
+        <w:gridCol w:w="2600"/>
+        <w:gridCol w:w="2253"/>
+        <w:gridCol w:w="2253"/>
+        <w:gridCol w:w="2254"/>
+      </w:tblGrid>
+      <w:tr>
+        <w:trPr>
+          <w:cantSplit/>
+          <w:tblHeader/>
+        </w:trPr>
+        <w:tc>
+          <w:tcPr>
+            <w:tcW w:type="dxa" w:w="2600"/>
+            <w:shd w:fill="F2F4F7"/>
+          </w:tcPr>
+          <w:p>
+            <w:pPr>
+              <w:pStyle w:val="CompactTable"/>
+            </w:pPr>
+            <w:r>
+              <w:t>Hipótesis</w:t>
+            </w:r>
+          </w:p>
+        </w:tc>
+        <w:tc>
+          <w:tcPr>
+            <w:tcW w:type="dxa" w:w="2253"/>
+            <w:shd w:fill="F2F4F7"/>
+          </w:tcPr>
+          <w:p>
+            <w:pPr>
+              <w:pStyle w:val="CompactTable"/>
+            </w:pPr>
+            <w:r>
+              <w:t>Factor</w:t>
+            </w:r>
+          </w:p>
+        </w:tc>
+        <w:tc>
+          <w:tcPr>
+            <w:tcW w:type="dxa" w:w="2253"/>
+            <w:shd w:fill="F2F4F7"/>
+          </w:tcPr>
+          <w:p>
+            <w:pPr>
+              <w:pStyle w:val="CompactTable"/>
+            </w:pPr>
+            <w:r>
+              <w:t>Evidencia disponible</w:t>
+            </w:r>
+          </w:p>
+        </w:tc>
+        <w:tc>
+          <w:tcPr>
+            <w:tcW w:type="dxa" w:w="2254"/>
+            <w:shd w:fill="F2F4F7"/>
+          </w:tcPr>
+          <w:p>
+            <w:pPr>
+              <w:pStyle w:val="CompactTable"/>
+            </w:pPr>
+            <w:r>
+              <w:t>Límite principal</w:t>
+            </w:r>
+          </w:p>
+        </w:tc>
+      </w:tr>
+      <w:tr>
+        <w:trPr>
+          <w:cantSplit/>
+        </w:trPr>
+        <w:tc>
+          <w:tcPr>
+            <w:tcW w:type="dxa" w:w="2600"/>
+          </w:tcPr>
+          <w:p>
+            <w:pPr>
+              <w:pStyle w:val="CompactTable"/>
+            </w:pPr>
+            <w:r>
+              <w:t>H1</w:t>
+            </w:r>
+          </w:p>
+        </w:tc>
+        <w:tc>
+          <w:tcPr>
+            <w:tcW w:type="dxa" w:w="2253"/>
+          </w:tcPr>
+          <w:p>
+            <w:pPr>
+              <w:pStyle w:val="CompactTable"/>
+            </w:pPr>
+            <w:r>
+              <w:t>Zona</w:t>
+            </w:r>
+          </w:p>
+        </w:tc>
+        <w:tc>
+          <w:tcPr>
+            <w:tcW w:type="dxa" w:w="2253"/>
+          </w:tcPr>
+          <w:p>
+            <w:pPr>
+              <w:pStyle w:val="CompactTable"/>
+            </w:pPr>
+            <w:r>
+              <w:t>Tasas y contraste histórico territorial</w:t>
+            </w:r>
+          </w:p>
+        </w:tc>
+        <w:tc>
+          <w:tcPr>
+            <w:tcW w:type="dxa" w:w="2254"/>
+          </w:tcPr>
+          <w:p>
+            <w:pPr>
+              <w:pStyle w:val="CompactTable"/>
+            </w:pPr>
+            <w:r>
+              <w:t>Cobertura y agrupación; no vínculo individual</w:t>
+            </w:r>
+          </w:p>
+        </w:tc>
+      </w:tr>
+      <w:tr>
+        <w:trPr>
+          <w:cantSplit/>
+        </w:trPr>
+        <w:tc>
+          <w:tcPr>
+            <w:tcW w:type="dxa" w:w="2600"/>
+          </w:tcPr>
+          <w:p>
+            <w:pPr>
+              <w:pStyle w:val="CompactTable"/>
+            </w:pPr>
+            <w:r>
+              <w:t>H2</w:t>
+            </w:r>
+          </w:p>
+        </w:tc>
+        <w:tc>
+          <w:tcPr>
+            <w:tcW w:type="dxa" w:w="2253"/>
+          </w:tcPr>
+          <w:p>
+            <w:pPr>
+              <w:pStyle w:val="CompactTable"/>
+            </w:pPr>
+            <w:r>
+              <w:t>Sexo</w:t>
+            </w:r>
+          </w:p>
+        </w:tc>
+        <w:tc>
+          <w:tcPr>
+            <w:tcW w:type="dxa" w:w="2253"/>
+          </w:tcPr>
+          <w:p>
+            <w:pPr>
+              <w:pStyle w:val="CompactTable"/>
+            </w:pPr>
+            <w:r>
+              <w:t>Asociación histórica y predictor demográfico</w:t>
+            </w:r>
+          </w:p>
+        </w:tc>
+        <w:tc>
+          <w:tcPr>
+            <w:tcW w:type="dxa" w:w="2254"/>
+          </w:tcPr>
+          <w:p>
+            <w:pPr>
+              <w:pStyle w:val="CompactTable"/>
+            </w:pPr>
+            <w:r>
+              <w:t>Señal limitada; no causa ni riesgo individual</w:t>
+            </w:r>
+          </w:p>
+        </w:tc>
+      </w:tr>
+      <w:tr>
+        <w:trPr>
+          <w:cantSplit/>
+        </w:trPr>
+        <w:tc>
+          <w:tcPr>
+            <w:tcW w:type="dxa" w:w="2600"/>
+          </w:tcPr>
+          <w:p>
+            <w:pPr>
+              <w:pStyle w:val="CompactTable"/>
+            </w:pPr>
+            <w:r>
+              <w:t>H3</w:t>
+            </w:r>
+          </w:p>
+        </w:tc>
+        <w:tc>
+          <w:tcPr>
+            <w:tcW w:type="dxa" w:w="2253"/>
+          </w:tcPr>
+          <w:p>
+            <w:pPr>
+              <w:pStyle w:val="CompactTable"/>
+            </w:pPr>
+            <w:r>
+              <w:t>Motocicletas</w:t>
+            </w:r>
+          </w:p>
+        </w:tc>
+        <w:tc>
+          <w:tcPr>
+            <w:tcW w:type="dxa" w:w="2253"/>
+          </w:tcPr>
+          <w:p>
+            <w:pPr>
+              <w:pStyle w:val="CompactTable"/>
+            </w:pPr>
+            <w:r>
+              <w:t>Descripción y contraste histórico condicionado</w:t>
+            </w:r>
+          </w:p>
+        </w:tc>
+        <w:tc>
+          <w:tcPr>
+            <w:tcW w:type="dxa" w:w="2254"/>
+          </w:tcPr>
+          <w:p>
+            <w:pPr>
+              <w:pStyle w:val="CompactTable"/>
+            </w:pPr>
+            <w:r>
+              <w:t>Rol de víctima y subconjunto no acreditados</w:t>
+            </w:r>
+          </w:p>
+        </w:tc>
+      </w:tr>
+      <w:tr>
+        <w:trPr>
+          <w:cantSplit/>
+        </w:trPr>
+        <w:tc>
+          <w:tcPr>
+            <w:tcW w:type="dxa" w:w="2600"/>
+          </w:tcPr>
+          <w:p>
+            <w:pPr>
+              <w:pStyle w:val="CompactTable"/>
+            </w:pPr>
+            <w:r>
+              <w:t>H4</w:t>
+            </w:r>
+          </w:p>
+        </w:tc>
+        <w:tc>
+          <w:tcPr>
+            <w:tcW w:type="dxa" w:w="2253"/>
+          </w:tcPr>
+          <w:p>
+            <w:pPr>
+              <w:pStyle w:val="CompactTable"/>
+            </w:pPr>
+            <w:r>
+              <w:t>Edad</w:t>
+            </w:r>
+          </w:p>
+        </w:tc>
+        <w:tc>
+          <w:tcPr>
+            <w:tcW w:type="dxa" w:w="2253"/>
+          </w:tcPr>
+          <w:p>
+            <w:pPr>
+              <w:pStyle w:val="CompactTable"/>
+            </w:pPr>
+            <w:r>
+              <w:t>Categoría nominal en modelo; antecedente ordinal</w:t>
+            </w:r>
+          </w:p>
+        </w:tc>
+        <w:tc>
+          <w:tcPr>
+            <w:tcW w:type="dxa" w:w="2254"/>
+          </w:tcPr>
+          <w:p>
+            <w:pPr>
+              <w:pStyle w:val="CompactTable"/>
+            </w:pPr>
+            <w:r>
+              <w:t>Histórico incluyó -1; desconocidos separados</w:t>
+            </w:r>
+          </w:p>
+        </w:tc>
+      </w:tr>
+    </w:tbl>
+    <w:p>
+      <w:r>
+        <w:t>H4: 353 víctimas de edad ignorada (292 heridas y 61 fallecidas) se conservan como categoría nominal independiente. edad_orden = -1 significa edad desconocida, no inferior a la de los niños. es_adulto_mayor = 0 en esos registros no acredita edad menor de 60 años. Los grupos separados son 4.832 menores de 60 con edad conocida, 308 de 60 años o más y 353 desconocidos. El modelo usa únicamente sexo y grupo_edad. El contraste ordinal histórico de Fase 2 eliminó nulos pero conservó -1; sus resultados no validan una comparación entre mayores y menores de 60. No se recalcula aquí: un nuevo análisis ordinal debe excluir los desconocidos del orden y reportarlos aparte.</w:t>
+      </w:r>
+    </w:p>
+    <w:p>
+      <w:r>
+        <w:t>H1 aporta diferencias territoriales descriptivas y un contraste histórico de efecto pequeño, condicionado por agrupación y cobertura. H2 aporta una asociación por sexo y H4 patrones por categorías de edad, incorporadas como los únicos predictores del experimento demográfico; el antecedente ordinal de H4 conserva la limitación de -1. H3 aporta conteos de siniestros con motociclistas y un contraste anterior condicionado a categorías no acreditadas. Se responde parcialmente la pregunta original: existe señal demográfica retrospectiva limitada y evidencia territorial separada; no se acredita un riesgo individual por vehículo ni el efecto conjunto de los cuatro factores. No se predice ocurrencia de siniestros, no se vinculan artificialmente registros y no se afirma causalidad.</w:t>
+      </w:r>
+    </w:p>
+    <w:p>
+      <w:r>
+        <w:br w:type="page"/>
+      </w:r>
+    </w:p>
+    <w:p>
+      <w:pPr>
+        <w:pStyle w:val="Heading1"/>
+      </w:pPr>
+      <w:r>
+        <w:t>12. Discusión y conclusiones académicas</w:t>
       </w:r>
     </w:p>
     <w:p>
@@ -2222,12 +3281,7 @@
     </w:p>
     <w:p>
       <w:r>
-        <w:t>12.2.10 registra 539 víctimas de siniestros protagonizados por motociclistas: 384 heridos y 155 fallecidos (28,76 %). 12.2.5 registra 1.324 víctimas en su cobertura: 1.055 heridos y 269 fallecidos. La resta histórica da 671 heridos y 114 fallecidos (14,52 %). Esa resta es aritmética; la equivalencia de cobertura y vehículo individual no está demostrada. Se conserva como contexto exploratorio, sin enlazar sus 1.324 filas con las 5.493 demográficas.</w:t>
-      </w:r>
-    </w:p>
-    <w:p>
-      <w:r>
-        <w:t>La pregunta original plantea la asociación del usuario motociclista, perfil demográfico y geografía con el desenlace fatal. Se responde parcialmente: las tablas documentan asociaciones separadas, y sexo/edad ofrecen una capacidad retrospectiva limitada. No se puede estimar el efecto conjunto ni la probabilidad de una víctima futura al no existir microdatos vinculados. Volumen de víctimas, proporción de fallecidos entre víctimas y riesgo de accidente en la población son conceptos diferentes.</w:t>
+        <w:t>H1 aporta diferencias territoriales descriptivas y un contraste histórico de efecto pequeño, condicionado por agrupación y cobertura. H2 aporta una asociación por sexo y H4 patrones por categorías de edad, incorporadas como los únicos predictores del experimento demográfico; el antecedente ordinal de H4 conserva la limitación de -1. H3 aporta conteos de siniestros con motociclistas y un contraste anterior condicionado a categorías no acreditadas. Se responde parcialmente la pregunta original: existe señal demográfica retrospectiva limitada y evidencia territorial separada; no se acredita un riesgo individual por vehículo ni el efecto conjunto de los cuatro factores. No se predice ocurrencia de siniestros, no se vinculan artificialmente registros y no se afirma causalidad.</w:t>
       </w:r>
     </w:p>
     <w:p>
@@ -2250,7 +3304,7 @@
         <w:pStyle w:val="Heading1"/>
       </w:pPr>
       <w:r>
-        <w:t>10. Reproducibilidad, referencias y uso de IA</w:t>
+        <w:t>13. Reproducibilidad, referencias y uso de IA</w:t>
       </w:r>
     </w:p>
     <w:p>
@@ -2265,7 +3319,7 @@
     </w:p>
     <w:p>
       <w:r>
-        <w:t>INE. Anuario 2021 - Estadísticas policiales y de accidentes de tránsito. Tablas originales del repositorio. Catálogo: https://www.datos.gov.py/dataset/anuario-2021-estadisticas-policiales-y-de-accidentes-de-transito</w:t>
+        <w:t>INE. Anuario 2021 - Estadísticas policiales y de accidentes de tránsito. Cuadros 12.2.5/12.2.6, p. 307, y 12.2.10, p. 311. PDF: https://www.ine.gov.py/Publicaciones/Biblioteca/documento/240/Anuario%20Estadistico%202021.pdf . Catálogo: https://www.datos.gov.py/dataset/anuario-2021-estadisticas-policiales-y-de-accidentes-de-transito</w:t>
       </w:r>
     </w:p>
     <w:p>

</xml_diff>